<commit_message>
updated capacitors lab, tweaks to oscilloscope lab
</commit_message>
<xml_diff>
--- a/electronics_manual/oscilloscope/VAC_and_VDC_symbols.docx
+++ b/electronics_manual/oscilloscope/VAC_and_VDC_symbols.docx
@@ -70,16 +70,12 @@
                               <w:pPr>
                                 <w:jc w:val="center"/>
                                 <w:rPr>
-                                  <w:b/>
-                                  <w:bCs/>
                                   <w:sz w:val="24"/>
                                   <w:szCs w:val="24"/>
                                 </w:rPr>
                               </w:pPr>
                               <w:r>
                                 <w:rPr>
-                                  <w:b/>
-                                  <w:bCs/>
                                   <w:sz w:val="24"/>
                                   <w:szCs w:val="24"/>
                                 </w:rPr>
@@ -770,16 +766,12 @@
                         <w:pPr>
                           <w:jc w:val="center"/>
                           <w:rPr>
-                            <w:b/>
-                            <w:bCs/>
                             <w:sz w:val="24"/>
                             <w:szCs w:val="24"/>
                           </w:rPr>
                         </w:pPr>
                         <w:r>
                           <w:rPr>
-                            <w:b/>
-                            <w:bCs/>
                             <w:sz w:val="24"/>
                             <w:szCs w:val="24"/>
                           </w:rPr>
@@ -857,16 +849,12 @@
                               <w:pPr>
                                 <w:jc w:val="center"/>
                                 <w:rPr>
-                                  <w:b/>
-                                  <w:bCs/>
                                   <w:sz w:val="24"/>
                                   <w:szCs w:val="24"/>
                                 </w:rPr>
                               </w:pPr>
                               <w:r>
                                 <w:rPr>
-                                  <w:b/>
-                                  <w:bCs/>
                                   <w:sz w:val="24"/>
                                   <w:szCs w:val="24"/>
                                 </w:rPr>
@@ -1042,16 +1030,12 @@
                         <w:pPr>
                           <w:jc w:val="center"/>
                           <w:rPr>
-                            <w:b/>
-                            <w:bCs/>
                             <w:sz w:val="24"/>
                             <w:szCs w:val="24"/>
                           </w:rPr>
                         </w:pPr>
                         <w:r>
                           <w:rPr>
-                            <w:b/>
-                            <w:bCs/>
                             <w:sz w:val="24"/>
                             <w:szCs w:val="24"/>
                           </w:rPr>

</xml_diff>